<commit_message>
casos de usos corregidos
</commit_message>
<xml_diff>
--- a/Documentation/User_cases/CU_03_Nimarinv.docx
+++ b/Documentation/User_cases/CU_03_Nimarinv.docx
@@ -1,6 +1,6 @@
 
 <file path=word/document.xml><?xml version="1.0" encoding="utf-8"?>
-<w:document xmlns:wpc="http://schemas.microsoft.com/office/word/2010/wordprocessingCanvas" xmlns:cx="http://schemas.microsoft.com/office/drawing/2014/chartex" xmlns:cx1="http://schemas.microsoft.com/office/drawing/2015/9/8/chartex" xmlns:cx2="http://schemas.microsoft.com/office/drawing/2015/10/21/chartex" xmlns:cx3="http://schemas.microsoft.com/office/drawing/2016/5/9/chartex" xmlns:cx4="http://schemas.microsoft.com/office/drawing/2016/5/10/chartex" xmlns:cx5="http://schemas.microsoft.com/office/drawing/2016/5/11/chartex" xmlns:cx6="http://schemas.microsoft.com/office/drawing/2016/5/12/chartex" xmlns:cx7="http://schemas.microsoft.com/office/drawing/2016/5/13/chartex" xmlns:cx8="http://schemas.microsoft.com/office/drawing/2016/5/14/chartex" xmlns:mc="http://schemas.openxmlformats.org/markup-compatibility/2006" xmlns:aink="http://schemas.microsoft.com/office/drawing/2016/ink" xmlns:am3d="http://schemas.microsoft.com/office/drawing/2017/model3d" xmlns:o="urn:schemas-microsoft-com:office:office" xmlns:oel="http://schemas.microsoft.com/office/2019/extlst" xmlns:r="http://schemas.openxmlformats.org/officeDocument/2006/relationships" xmlns:m="http://schemas.openxmlformats.org/officeDocument/2006/math" xmlns:v="urn:schemas-microsoft-com:vml" xmlns:wp14="http://schemas.microsoft.com/office/word/2010/wordprocessingDrawing" xmlns:wp="http://schemas.openxmlformats.org/drawingml/2006/wordprocessingDrawing" xmlns:w10="urn:schemas-microsoft-com:office:word" xmlns:w="http://schemas.openxmlformats.org/wordprocessingml/2006/main" xmlns:w14="http://schemas.microsoft.com/office/word/2010/wordml" xmlns:w15="http://schemas.microsoft.com/office/word/2012/wordml" xmlns:w16cex="http://schemas.microsoft.com/office/word/2018/wordml/cex" xmlns:w16cid="http://schemas.microsoft.com/office/word/2016/wordml/cid" xmlns:w16="http://schemas.microsoft.com/office/word/2018/wordml" xmlns:w16du="http://schemas.microsoft.com/office/word/2023/wordml/word16du" xmlns:w16sdtdh="http://schemas.microsoft.com/office/word/2020/wordml/sdtdatahash" xmlns:w16sdtfl="http://schemas.microsoft.com/office/word/2024/wordml/sdtformatlock" xmlns:w16se="http://schemas.microsoft.com/office/word/2015/wordml/symex" xmlns:wpg="http://schemas.microsoft.com/office/word/2010/wordprocessingGroup" xmlns:wpi="http://schemas.microsoft.com/office/word/2010/wordprocessingInk" xmlns:wne="http://schemas.microsoft.com/office/word/2006/wordml" xmlns:wps="http://schemas.microsoft.com/office/word/2010/wordprocessingShape" mc:Ignorable="w14 w15 w16se w16cid w16 w16cex w16sdtdh w16sdtfl w16du wp14">
+<w:document xmlns:wpc="http://schemas.microsoft.com/office/word/2010/wordprocessingCanvas" xmlns:cx="http://schemas.microsoft.com/office/drawing/2014/chartex" xmlns:cx1="http://schemas.microsoft.com/office/drawing/2015/9/8/chartex" xmlns:cx2="http://schemas.microsoft.com/office/drawing/2015/10/21/chartex" xmlns:cx3="http://schemas.microsoft.com/office/drawing/2016/5/9/chartex" xmlns:cx4="http://schemas.microsoft.com/office/drawing/2016/5/10/chartex" xmlns:cx5="http://schemas.microsoft.com/office/drawing/2016/5/11/chartex" xmlns:cx6="http://schemas.microsoft.com/office/drawing/2016/5/12/chartex" xmlns:cx7="http://schemas.microsoft.com/office/drawing/2016/5/13/chartex" xmlns:cx8="http://schemas.microsoft.com/office/drawing/2016/5/14/chartex" xmlns:mc="http://schemas.openxmlformats.org/markup-compatibility/2006" xmlns:aink="http://schemas.microsoft.com/office/drawing/2016/ink" xmlns:am3d="http://schemas.microsoft.com/office/drawing/2017/model3d" xmlns:o="urn:schemas-microsoft-com:office:office" xmlns:oel="http://schemas.microsoft.com/office/2019/extlst" xmlns:r="http://schemas.openxmlformats.org/officeDocument/2006/relationships" xmlns:m="http://schemas.openxmlformats.org/officeDocument/2006/math" xmlns:v="urn:schemas-microsoft-com:vml" xmlns:wp14="http://schemas.microsoft.com/office/word/2010/wordprocessingDrawing" xmlns:wp="http://schemas.openxmlformats.org/drawingml/2006/wordprocessingDrawing" xmlns:w10="urn:schemas-microsoft-com:office:word" xmlns:w="http://schemas.openxmlformats.org/wordprocessingml/2006/main" xmlns:w14="http://schemas.microsoft.com/office/word/2010/wordml" xmlns:w15="http://schemas.microsoft.com/office/word/2012/wordml" xmlns:w16cex="http://schemas.microsoft.com/office/word/2018/wordml/cex" xmlns:w16cid="http://schemas.microsoft.com/office/word/2016/wordml/cid" xmlns:w16="http://schemas.microsoft.com/office/word/2018/wordml" xmlns:w16sdtdh="http://schemas.microsoft.com/office/word/2020/wordml/sdtdatahash" xmlns:w16se="http://schemas.microsoft.com/office/word/2015/wordml/symex" xmlns:wpg="http://schemas.microsoft.com/office/word/2010/wordprocessingGroup" xmlns:wpi="http://schemas.microsoft.com/office/word/2010/wordprocessingInk" xmlns:wne="http://schemas.microsoft.com/office/word/2006/wordml" xmlns:wps="http://schemas.microsoft.com/office/word/2010/wordprocessingShape" mc:Ignorable="w14 w15 w16se w16cid w16 w16cex w16sdtdh wp14">
   <w:body>
     <w:p>
       <w:pPr>
@@ -133,6 +133,8 @@
         <w:jc w:val="right"/>
         <w:rPr>
           <w:rFonts w:ascii="Helvetica Neue" w:eastAsia="Helvetica Neue" w:hAnsi="Helvetica Neue" w:cs="Helvetica Neue"/>
+          <w:b/>
+          <w:bCs/>
           <w:sz w:val="20"/>
           <w:szCs w:val="20"/>
         </w:rPr>
@@ -150,9 +152,11 @@
     </w:p>
     <w:p>
       <w:pPr>
-        <w:jc w:val="both"/>
+        <w:jc w:val="right"/>
         <w:rPr>
           <w:rFonts w:ascii="Helvetica Neue" w:eastAsia="Helvetica Neue" w:hAnsi="Helvetica Neue" w:cs="Helvetica Neue"/>
+          <w:b/>
+          <w:bCs/>
           <w:sz w:val="20"/>
           <w:szCs w:val="20"/>
         </w:rPr>
@@ -260,7 +264,17 @@
               <w:br/>
             </w:r>
             <w:r>
-              <w:t>Usuario</w:t>
+              <w:t>Administrador</w:t>
+            </w:r>
+          </w:p>
+          <w:p>
+            <w:pPr>
+              <w:widowControl w:val="0"/>
+              <w:spacing w:line="240" w:lineRule="auto"/>
+              <w:jc w:val="both"/>
+            </w:pPr>
+            <w:r>
+              <w:t>Maestro Panadero</w:t>
             </w:r>
           </w:p>
           <w:p>
@@ -306,8 +320,13 @@
               <w:jc w:val="both"/>
             </w:pPr>
             <w:r>
-              <w:t>RF_12 – El sistema debe estimar el tiempo total de horneado de la receta en base a la cantidad de unidades ingresadas, la capacidad del horno y el tiempo de horneado</w:t>
-            </w:r>
+              <w:t xml:space="preserve">RF_03 – El sistema debe permitir consolidar múltiples </w:t>
+            </w:r>
+            <w:proofErr w:type="spellStart"/>
+            <w:r>
+              <w:t>subrecetas</w:t>
+            </w:r>
+            <w:proofErr w:type="spellEnd"/>
           </w:p>
           <w:p>
             <w:pPr>
@@ -315,6 +334,29 @@
               <w:spacing w:line="240" w:lineRule="auto"/>
               <w:jc w:val="both"/>
             </w:pPr>
+            <w:r>
+              <w:t>e ingredientes individuales en</w:t>
+            </w:r>
+          </w:p>
+          <w:p>
+            <w:pPr>
+              <w:widowControl w:val="0"/>
+              <w:spacing w:line="240" w:lineRule="auto"/>
+              <w:jc w:val="both"/>
+            </w:pPr>
+            <w:r>
+              <w:t>una interfaz de gestión unificada</w:t>
+            </w:r>
+          </w:p>
+          <w:p>
+            <w:pPr>
+              <w:widowControl w:val="0"/>
+              <w:spacing w:line="240" w:lineRule="auto"/>
+              <w:jc w:val="both"/>
+            </w:pPr>
+            <w:r>
+              <w:t>para modelar recetas.</w:t>
+            </w:r>
           </w:p>
         </w:tc>
       </w:tr>
@@ -358,7 +400,7 @@
               <w:jc w:val="both"/>
             </w:pPr>
             <w:r>
-              <w:t>El sistema desplegará una notificación preguntando la cantidad de unidades, después de ingresadas, otra notificación aparecerá preguntando la cantidad de unidades horneables al mismo tiempo</w:t>
+              <w:t>El usuario debe poder seleccionar del catalogó diferentes ingredientes y recetas ya existentes para crear una nueva receta en base a estas, esto lo hará marcando los elementos respectivos y poniéndolos en el orden cronológico deseado.</w:t>
             </w:r>
           </w:p>
         </w:tc>
@@ -417,14 +459,7 @@
               </w:rPr>
             </w:pPr>
             <w:r>
-              <w:t xml:space="preserve">El usuario debe dar al botón </w:t>
-            </w:r>
-            <w:r>
-              <w:rPr>
-                <w:b/>
-                <w:bCs/>
-              </w:rPr>
-              <w:t>“Calcular tiempo”</w:t>
+              <w:t>El usuario debe dar al botón de nueva receta en la interfaz</w:t>
             </w:r>
           </w:p>
         </w:tc>
@@ -464,159 +499,414 @@
           </w:p>
           <w:p>
             <w:pPr>
-              <w:pStyle w:val="ListParagraph"/>
               <w:widowControl w:val="0"/>
               <w:numPr>
                 <w:ilvl w:val="0"/>
-                <w:numId w:val="5"/>
+                <w:numId w:val="3"/>
               </w:numPr>
               <w:spacing w:line="240" w:lineRule="auto"/>
               <w:jc w:val="both"/>
             </w:pPr>
             <w:r>
-              <w:t xml:space="preserve">El usuario da clic al botón </w:t>
-            </w:r>
-            <w:r>
-              <w:rPr>
-                <w:b/>
-                <w:bCs/>
-              </w:rPr>
-              <w:t>“Calcular tiempo”</w:t>
+              <w:t xml:space="preserve">El usuario da al botón de </w:t>
+            </w:r>
+            <w:r>
+              <w:rPr>
+                <w:b/>
+                <w:bCs/>
+              </w:rPr>
+              <w:t xml:space="preserve">“crear receta” </w:t>
+            </w:r>
+            <w:r>
+              <w:t>desde la interfaz principal</w:t>
             </w:r>
           </w:p>
           <w:p>
             <w:pPr>
-              <w:pStyle w:val="ListParagraph"/>
               <w:widowControl w:val="0"/>
               <w:numPr>
                 <w:ilvl w:val="0"/>
-                <w:numId w:val="5"/>
-              </w:numPr>
-              <w:spacing w:line="240" w:lineRule="auto"/>
-              <w:jc w:val="both"/>
-              <w:rPr>
-                <w:b/>
-                <w:bCs/>
-              </w:rPr>
-            </w:pPr>
-            <w:r>
-              <w:t xml:space="preserve">El sistema despliega una notificación con un campo de texto para ingresar el número de unidades, un campo de texto para ingresar la cantidad de unidades por tanda y selectores de tiempo, para la cantidad de tiempo de horneado y otro para el tiempo de maniobra y la cantidad de hornos, además de un botón </w:t>
-            </w:r>
-            <w:r>
-              <w:rPr>
-                <w:b/>
-                <w:bCs/>
-              </w:rPr>
-              <w:t>“Cancelar”</w:t>
-            </w:r>
-            <w:r>
-              <w:t xml:space="preserve"> y </w:t>
-            </w:r>
-            <w:r>
-              <w:rPr>
-                <w:b/>
-                <w:bCs/>
-              </w:rPr>
-              <w:t>“Estimar tiempo”</w:t>
-            </w:r>
-          </w:p>
-          <w:p>
-            <w:pPr>
-              <w:pStyle w:val="ListParagraph"/>
-              <w:widowControl w:val="0"/>
-              <w:numPr>
-                <w:ilvl w:val="0"/>
-                <w:numId w:val="5"/>
+                <w:numId w:val="3"/>
               </w:numPr>
               <w:spacing w:line="240" w:lineRule="auto"/>
               <w:jc w:val="both"/>
             </w:pPr>
             <w:r>
-              <w:t xml:space="preserve">El usuario oprime </w:t>
-            </w:r>
-            <w:r>
-              <w:rPr>
-                <w:b/>
-                <w:bCs/>
-              </w:rPr>
-              <w:t xml:space="preserve">“estimar tiempo” </w:t>
-            </w:r>
-            <w:r>
-              <w:t>o “</w:t>
-            </w:r>
-            <w:r>
-              <w:rPr>
-                <w:b/>
-                <w:bCs/>
-              </w:rPr>
-              <w:t>Cancelar”</w:t>
+              <w:t xml:space="preserve">El sistema le redirecciona a una nueva interfaz donde aparece los botones </w:t>
+            </w:r>
+            <w:r>
+              <w:rPr>
+                <w:b/>
+                <w:bCs/>
+              </w:rPr>
+              <w:t>“Ingredientes”</w:t>
+            </w:r>
+            <w:r>
+              <w:t xml:space="preserve"> y </w:t>
+            </w:r>
+            <w:r>
+              <w:rPr>
+                <w:b/>
+                <w:bCs/>
+              </w:rPr>
+              <w:t>“Recetas”</w:t>
             </w:r>
           </w:p>
           <w:p>
             <w:pPr>
-              <w:pStyle w:val="ListParagraph"/>
               <w:widowControl w:val="0"/>
               <w:numPr>
                 <w:ilvl w:val="0"/>
-                <w:numId w:val="6"/>
+                <w:numId w:val="3"/>
               </w:numPr>
               <w:spacing w:line="240" w:lineRule="auto"/>
               <w:jc w:val="both"/>
             </w:pPr>
             <w:r>
-              <w:t xml:space="preserve">El usuario oprime </w:t>
-            </w:r>
-            <w:r>
-              <w:rPr>
-                <w:b/>
-                <w:bCs/>
-              </w:rPr>
-              <w:t xml:space="preserve">“Estimar tiempo” </w:t>
-            </w:r>
-            <w:r>
-              <w:t xml:space="preserve">y el sistema despliega una notificación con el tiempo estimado requerido y un botón </w:t>
-            </w:r>
-            <w:r>
-              <w:rPr>
-                <w:b/>
-                <w:bCs/>
-              </w:rPr>
-              <w:t>“Volver al taller”</w:t>
-            </w:r>
-            <w:r>
-              <w:rPr>
-                <w:b/>
-                <w:bCs/>
-              </w:rPr>
-              <w:t xml:space="preserve"> </w:t>
-            </w:r>
-            <w:r>
-              <w:t>que al ser oprimido lo retorna al modo taller</w:t>
+              <w:t xml:space="preserve">Según el botón seleccionado aparece la información almacenada en la base de datos donde junto a una </w:t>
+            </w:r>
+            <w:proofErr w:type="spellStart"/>
+            <w:r>
+              <w:t>checkbox</w:t>
+            </w:r>
+            <w:proofErr w:type="spellEnd"/>
+            <w:r>
+              <w:t xml:space="preserve"> para seleccionarlos</w:t>
             </w:r>
           </w:p>
           <w:p>
             <w:pPr>
-              <w:pStyle w:val="ListParagraph"/>
               <w:widowControl w:val="0"/>
               <w:numPr>
                 <w:ilvl w:val="0"/>
-                <w:numId w:val="6"/>
+                <w:numId w:val="3"/>
               </w:numPr>
               <w:spacing w:line="240" w:lineRule="auto"/>
               <w:jc w:val="both"/>
             </w:pPr>
             <w:r>
-              <w:t xml:space="preserve">El usuario oprime </w:t>
-            </w:r>
-            <w:r>
-              <w:rPr>
-                <w:b/>
-                <w:bCs/>
-              </w:rPr>
-              <w:t xml:space="preserve">“Cancelar” </w:t>
-            </w:r>
-            <w:r>
-              <w:t xml:space="preserve">y vuelve al modo taller instantáneamente </w:t>
+              <w:t xml:space="preserve">Al dar a </w:t>
+            </w:r>
+            <w:r>
+              <w:rPr>
+                <w:b/>
+                <w:bCs/>
+              </w:rPr>
+              <w:t>“cancelar”</w:t>
+            </w:r>
+            <w:r>
+              <w:t xml:space="preserve"> retorna inmediatamente al menú principal</w:t>
+            </w:r>
+          </w:p>
+          <w:p>
+            <w:pPr>
+              <w:widowControl w:val="0"/>
+              <w:numPr>
+                <w:ilvl w:val="0"/>
+                <w:numId w:val="3"/>
+              </w:numPr>
+              <w:spacing w:line="240" w:lineRule="auto"/>
+              <w:jc w:val="both"/>
+              <w:rPr>
+                <w:b/>
+                <w:bCs/>
+              </w:rPr>
+            </w:pPr>
+            <w:r>
+              <w:t>A</w:t>
+            </w:r>
+            <w:r>
+              <w:t>l</w:t>
+            </w:r>
+            <w:r>
+              <w:t xml:space="preserve"> dar clic a </w:t>
+            </w:r>
+            <w:r>
+              <w:rPr>
+                <w:b/>
+                <w:bCs/>
+              </w:rPr>
+              <w:t>“</w:t>
+            </w:r>
+            <w:r>
+              <w:rPr>
+                <w:b/>
+                <w:bCs/>
+              </w:rPr>
+              <w:t>Finalizar</w:t>
+            </w:r>
+            <w:r>
+              <w:rPr>
+                <w:b/>
+                <w:bCs/>
+              </w:rPr>
+              <w:t>”</w:t>
+            </w:r>
+            <w:r>
+              <w:t xml:space="preserve"> sistema valida que la receta cuente con mínimo </w:t>
+            </w:r>
+            <w:r>
+              <w:t>dos</w:t>
+            </w:r>
+            <w:r>
+              <w:t xml:space="preserve"> elemento</w:t>
+            </w:r>
+            <w:r>
+              <w:t>s</w:t>
+            </w:r>
+            <w:r>
+              <w:t>,</w:t>
+            </w:r>
+          </w:p>
+          <w:p>
+            <w:pPr>
+              <w:pStyle w:val="Prrafodelista"/>
+              <w:widowControl w:val="0"/>
+              <w:numPr>
+                <w:ilvl w:val="1"/>
+                <w:numId w:val="3"/>
+              </w:numPr>
+              <w:spacing w:line="240" w:lineRule="auto"/>
+              <w:jc w:val="both"/>
+              <w:rPr>
+                <w:b/>
+                <w:bCs/>
+              </w:rPr>
+            </w:pPr>
+            <w:r>
+              <w:t xml:space="preserve">en caso </w:t>
+            </w:r>
+            <w:r>
+              <w:t xml:space="preserve">de no haber 2 </w:t>
+            </w:r>
+            <w:r>
+              <w:t>lanzara un aviso</w:t>
+            </w:r>
+            <w:r>
+              <w:rPr>
+                <w:b/>
+                <w:bCs/>
+              </w:rPr>
+              <w:t xml:space="preserve"> {</w:t>
+            </w:r>
+            <w:r>
+              <w:rPr>
+                <w:b/>
+                <w:bCs/>
+              </w:rPr>
+              <w:t xml:space="preserve">Debes ingresar 2 o </w:t>
+            </w:r>
+            <w:proofErr w:type="spellStart"/>
+            <w:r>
+              <w:rPr>
+                <w:b/>
+                <w:bCs/>
+              </w:rPr>
+              <w:t>mas</w:t>
+            </w:r>
+            <w:proofErr w:type="spellEnd"/>
+            <w:r>
+              <w:rPr>
+                <w:b/>
+                <w:bCs/>
+              </w:rPr>
+              <w:t xml:space="preserve"> elementos</w:t>
+            </w:r>
+            <w:r>
+              <w:rPr>
+                <w:b/>
+                <w:bCs/>
+              </w:rPr>
+              <w:t xml:space="preserve">} </w:t>
+            </w:r>
+            <w:r>
+              <w:t>junto a un botón</w:t>
+            </w:r>
+            <w:r>
+              <w:rPr>
+                <w:b/>
+                <w:bCs/>
+              </w:rPr>
+              <w:t xml:space="preserve"> “aceptar”</w:t>
+            </w:r>
+          </w:p>
+          <w:p>
+            <w:pPr>
+              <w:pStyle w:val="Prrafodelista"/>
+              <w:widowControl w:val="0"/>
+              <w:numPr>
+                <w:ilvl w:val="1"/>
+                <w:numId w:val="3"/>
+              </w:numPr>
+              <w:spacing w:line="240" w:lineRule="auto"/>
+              <w:jc w:val="both"/>
+            </w:pPr>
+            <w:r>
+              <w:t xml:space="preserve">El usuario da clic al botón </w:t>
+            </w:r>
+            <w:r>
+              <w:rPr>
+                <w:b/>
+                <w:bCs/>
+              </w:rPr>
+              <w:t>“aceptar”</w:t>
+            </w:r>
+            <w:r>
+              <w:t xml:space="preserve"> y vuelve a la interfaz donde</w:t>
+            </w:r>
+            <w:r>
+              <w:t xml:space="preserve"> están los ingredientes guardados con </w:t>
+            </w:r>
+            <w:proofErr w:type="spellStart"/>
+            <w:r>
+              <w:t>anteridad</w:t>
+            </w:r>
+            <w:proofErr w:type="spellEnd"/>
+          </w:p>
+          <w:p>
+            <w:pPr>
+              <w:widowControl w:val="0"/>
+              <w:numPr>
+                <w:ilvl w:val="0"/>
+                <w:numId w:val="3"/>
+              </w:numPr>
+              <w:spacing w:line="240" w:lineRule="auto"/>
+              <w:jc w:val="both"/>
+            </w:pPr>
+            <w:r>
+              <w:t xml:space="preserve">En caso de haber dos o </w:t>
+            </w:r>
+            <w:r>
+              <w:t>más</w:t>
+            </w:r>
+            <w:r>
+              <w:t xml:space="preserve"> ingredientes el sistema almacenara la receta en la base de datos, y dando una alerta de </w:t>
+            </w:r>
+            <w:r>
+              <w:rPr>
+                <w:b/>
+                <w:bCs/>
+              </w:rPr>
+              <w:t>{Receta guardada con éxito}</w:t>
+            </w:r>
+            <w:r>
+              <w:t xml:space="preserve"> junto a los botones </w:t>
+            </w:r>
+            <w:r>
+              <w:rPr>
+                <w:b/>
+                <w:bCs/>
+              </w:rPr>
+              <w:t>“crear nueva receta”</w:t>
+            </w:r>
+            <w:r>
+              <w:t xml:space="preserve"> y </w:t>
+            </w:r>
+            <w:r>
+              <w:rPr>
+                <w:b/>
+                <w:bCs/>
+              </w:rPr>
+              <w:t>“</w:t>
+            </w:r>
+            <w:r>
+              <w:rPr>
+                <w:b/>
+                <w:bCs/>
+              </w:rPr>
+              <w:t xml:space="preserve">Volver al </w:t>
+            </w:r>
+            <w:proofErr w:type="spellStart"/>
+            <w:r>
+              <w:rPr>
+                <w:b/>
+                <w:bCs/>
+              </w:rPr>
+              <w:t>menu</w:t>
+            </w:r>
+            <w:proofErr w:type="spellEnd"/>
+            <w:r>
+              <w:rPr>
+                <w:b/>
+                <w:bCs/>
+              </w:rPr>
+              <w:t>”</w:t>
+            </w:r>
+          </w:p>
+          <w:p>
+            <w:pPr>
+              <w:pStyle w:val="Prrafodelista"/>
+              <w:widowControl w:val="0"/>
+              <w:numPr>
+                <w:ilvl w:val="1"/>
+                <w:numId w:val="3"/>
+              </w:numPr>
+              <w:spacing w:line="240" w:lineRule="auto"/>
+              <w:jc w:val="both"/>
+            </w:pPr>
+            <w:r>
+              <w:t>En caso de dar clic en</w:t>
+            </w:r>
+            <w:r>
+              <w:t xml:space="preserve"> </w:t>
+            </w:r>
+            <w:r>
+              <w:rPr>
+                <w:b/>
+                <w:bCs/>
+              </w:rPr>
+              <w:t>“crear nueva receta”</w:t>
+            </w:r>
+            <w:r>
+              <w:t xml:space="preserve"> vuelve al apartado 2</w:t>
+            </w:r>
+          </w:p>
+          <w:p>
+            <w:pPr>
+              <w:pStyle w:val="Prrafodelista"/>
+              <w:widowControl w:val="0"/>
+              <w:numPr>
+                <w:ilvl w:val="1"/>
+                <w:numId w:val="3"/>
+              </w:numPr>
+              <w:spacing w:line="240" w:lineRule="auto"/>
+              <w:jc w:val="both"/>
+            </w:pPr>
+            <w:r>
+              <w:t xml:space="preserve">Al dar clic al botón </w:t>
+            </w:r>
+            <w:r>
+              <w:rPr>
+                <w:b/>
+                <w:bCs/>
+              </w:rPr>
+              <w:t>“</w:t>
+            </w:r>
+            <w:r>
+              <w:rPr>
+                <w:b/>
+                <w:bCs/>
+              </w:rPr>
+              <w:t xml:space="preserve">Volver al </w:t>
+            </w:r>
+            <w:proofErr w:type="spellStart"/>
+            <w:r>
+              <w:rPr>
+                <w:b/>
+                <w:bCs/>
+              </w:rPr>
+              <w:t>menu</w:t>
+            </w:r>
+            <w:proofErr w:type="spellEnd"/>
+            <w:r>
+              <w:rPr>
+                <w:b/>
+                <w:bCs/>
+              </w:rPr>
+              <w:t>”</w:t>
+            </w:r>
+            <w:r>
+              <w:t xml:space="preserve"> es redireccionado al menú principal</w:t>
             </w:r>
           </w:p>
         </w:tc>
@@ -661,7 +951,7 @@
               <w:jc w:val="both"/>
             </w:pPr>
             <w:r>
-              <w:t>El tiempo es mostrado en la interfaz del taller</w:t>
+              <w:t>La receta es almacenada en la base de datos</w:t>
             </w:r>
           </w:p>
         </w:tc>
@@ -696,6 +986,7 @@
                 <w:b/>
                 <w:bCs/>
               </w:rPr>
+              <w:lastRenderedPageBreak/>
               <w:t>NOTAS</w:t>
             </w:r>
           </w:p>
@@ -710,25 +1001,24 @@
     </w:p>
     <w:p>
       <w:pPr>
-        <w:spacing w:before="240" w:after="240"/>
-        <w:jc w:val="both"/>
-      </w:pPr>
-    </w:p>
-    <w:p>
-      <w:pPr>
-        <w:spacing w:before="240" w:after="240"/>
-        <w:jc w:val="both"/>
+        <w:jc w:val="right"/>
+        <w:rPr>
+          <w:rFonts w:ascii="Helvetica Neue" w:eastAsia="Helvetica Neue" w:hAnsi="Helvetica Neue" w:cs="Helvetica Neue"/>
+          <w:b/>
+          <w:bCs/>
+          <w:sz w:val="20"/>
+          <w:szCs w:val="20"/>
+        </w:rPr>
       </w:pPr>
       <w:r>
         <w:rPr>
           <w:noProof/>
         </w:rPr>
-        <w:lastRenderedPageBreak/>
         <w:drawing>
-          <wp:inline distT="0" distB="0" distL="0" distR="0" wp14:anchorId="328CB657" wp14:editId="74C4ECBC">
-            <wp:extent cx="5733415" cy="4839335"/>
-            <wp:effectExtent l="0" t="0" r="635" b="0"/>
-            <wp:docPr id="314773890" name="Picture 2"/>
+          <wp:inline distT="0" distB="0" distL="0" distR="0" wp14:anchorId="79CFF9CF" wp14:editId="2B5CD81B">
+            <wp:extent cx="5733415" cy="4838065"/>
+            <wp:effectExtent l="0" t="0" r="635" b="635"/>
+            <wp:docPr id="829700591" name="Picture 2"/>
             <wp:cNvGraphicFramePr>
               <a:graphicFrameLocks xmlns:a="http://schemas.openxmlformats.org/drawingml/2006/main" noChangeAspect="1"/>
             </wp:cNvGraphicFramePr>
@@ -757,7 +1047,71 @@
                   <pic:spPr bwMode="auto">
                     <a:xfrm>
                       <a:off x="0" y="0"/>
-                      <a:ext cx="5733415" cy="4839335"/>
+                      <a:ext cx="5733415" cy="4838065"/>
+                    </a:xfrm>
+                    <a:prstGeom prst="rect">
+                      <a:avLst/>
+                    </a:prstGeom>
+                    <a:noFill/>
+                    <a:ln>
+                      <a:noFill/>
+                    </a:ln>
+                  </pic:spPr>
+                </pic:pic>
+              </a:graphicData>
+            </a:graphic>
+          </wp:inline>
+        </w:drawing>
+      </w:r>
+    </w:p>
+    <w:p>
+      <w:pPr>
+        <w:jc w:val="right"/>
+        <w:rPr>
+          <w:rFonts w:ascii="Helvetica Neue" w:eastAsia="Helvetica Neue" w:hAnsi="Helvetica Neue" w:cs="Helvetica Neue"/>
+          <w:sz w:val="20"/>
+          <w:szCs w:val="20"/>
+        </w:rPr>
+      </w:pPr>
+      <w:r>
+        <w:rPr>
+          <w:noProof/>
+        </w:rPr>
+        <w:lastRenderedPageBreak/>
+        <w:drawing>
+          <wp:inline distT="0" distB="0" distL="0" distR="0" wp14:anchorId="67A5E3C4" wp14:editId="038BDB66">
+            <wp:extent cx="5733415" cy="4838065"/>
+            <wp:effectExtent l="0" t="0" r="635" b="635"/>
+            <wp:docPr id="954905714" name="Picture 3"/>
+            <wp:cNvGraphicFramePr>
+              <a:graphicFrameLocks xmlns:a="http://schemas.openxmlformats.org/drawingml/2006/main" noChangeAspect="1"/>
+            </wp:cNvGraphicFramePr>
+            <a:graphic xmlns:a="http://schemas.openxmlformats.org/drawingml/2006/main">
+              <a:graphicData uri="http://schemas.openxmlformats.org/drawingml/2006/picture">
+                <pic:pic xmlns:pic="http://schemas.openxmlformats.org/drawingml/2006/picture">
+                  <pic:nvPicPr>
+                    <pic:cNvPr id="0" name="Picture 3"/>
+                    <pic:cNvPicPr>
+                      <a:picLocks noChangeAspect="1" noChangeArrowheads="1"/>
+                    </pic:cNvPicPr>
+                  </pic:nvPicPr>
+                  <pic:blipFill>
+                    <a:blip r:embed="rId9">
+                      <a:extLst>
+                        <a:ext uri="{28A0092B-C50C-407E-A947-70E740481C1C}">
+                          <a14:useLocalDpi xmlns:a14="http://schemas.microsoft.com/office/drawing/2010/main" val="0"/>
+                        </a:ext>
+                      </a:extLst>
+                    </a:blip>
+                    <a:srcRect/>
+                    <a:stretch>
+                      <a:fillRect/>
+                    </a:stretch>
+                  </pic:blipFill>
+                  <pic:spPr bwMode="auto">
+                    <a:xfrm>
+                      <a:off x="0" y="0"/>
+                      <a:ext cx="5733415" cy="4838065"/>
                     </a:xfrm>
                     <a:prstGeom prst="rect">
                       <a:avLst/>
@@ -779,10 +1133,10 @@
         </w:rPr>
         <w:lastRenderedPageBreak/>
         <w:drawing>
-          <wp:inline distT="0" distB="0" distL="0" distR="0" wp14:anchorId="5B3C01F8" wp14:editId="1B44ABFF">
-            <wp:extent cx="5733415" cy="4839335"/>
-            <wp:effectExtent l="0" t="0" r="635" b="0"/>
-            <wp:docPr id="1208009246" name="Picture 1"/>
+          <wp:inline distT="0" distB="0" distL="0" distR="0" wp14:anchorId="0ED6D955" wp14:editId="5A478F41">
+            <wp:extent cx="5733415" cy="4838065"/>
+            <wp:effectExtent l="0" t="0" r="635" b="635"/>
+            <wp:docPr id="114192587" name="Picture 1"/>
             <wp:cNvGraphicFramePr>
               <a:graphicFrameLocks xmlns:a="http://schemas.openxmlformats.org/drawingml/2006/main" noChangeAspect="1"/>
             </wp:cNvGraphicFramePr>
@@ -796,7 +1150,7 @@
                     </pic:cNvPicPr>
                   </pic:nvPicPr>
                   <pic:blipFill>
-                    <a:blip r:embed="rId9">
+                    <a:blip r:embed="rId10">
                       <a:extLst>
                         <a:ext uri="{28A0092B-C50C-407E-A947-70E740481C1C}">
                           <a14:useLocalDpi xmlns:a14="http://schemas.microsoft.com/office/drawing/2010/main" val="0"/>
@@ -811,7 +1165,7 @@
                   <pic:spPr bwMode="auto">
                     <a:xfrm>
                       <a:off x="0" y="0"/>
-                      <a:ext cx="5733415" cy="4839335"/>
+                      <a:ext cx="5733415" cy="4838065"/>
                     </a:xfrm>
                     <a:prstGeom prst="rect">
                       <a:avLst/>
@@ -829,7 +1183,7 @@
       </w:r>
     </w:p>
     <w:sectPr>
-      <w:headerReference w:type="default" r:id="rId10"/>
+      <w:headerReference w:type="default" r:id="rId11"/>
       <w:pgSz w:w="11909" w:h="16834"/>
       <w:pgMar w:top="1440" w:right="1440" w:bottom="1440" w:left="1440" w:header="720" w:footer="720" w:gutter="0"/>
       <w:pgNumType w:start="1"/>
@@ -840,7 +1194,7 @@
 </file>
 
 <file path=word/endnotes.xml><?xml version="1.0" encoding="utf-8"?>
-<w:endnotes xmlns:wpc="http://schemas.microsoft.com/office/word/2010/wordprocessingCanvas" xmlns:cx="http://schemas.microsoft.com/office/drawing/2014/chartex" xmlns:cx1="http://schemas.microsoft.com/office/drawing/2015/9/8/chartex" xmlns:cx2="http://schemas.microsoft.com/office/drawing/2015/10/21/chartex" xmlns:cx3="http://schemas.microsoft.com/office/drawing/2016/5/9/chartex" xmlns:cx4="http://schemas.microsoft.com/office/drawing/2016/5/10/chartex" xmlns:cx5="http://schemas.microsoft.com/office/drawing/2016/5/11/chartex" xmlns:cx6="http://schemas.microsoft.com/office/drawing/2016/5/12/chartex" xmlns:cx7="http://schemas.microsoft.com/office/drawing/2016/5/13/chartex" xmlns:cx8="http://schemas.microsoft.com/office/drawing/2016/5/14/chartex" xmlns:mc="http://schemas.openxmlformats.org/markup-compatibility/2006" xmlns:aink="http://schemas.microsoft.com/office/drawing/2016/ink" xmlns:am3d="http://schemas.microsoft.com/office/drawing/2017/model3d" xmlns:o="urn:schemas-microsoft-com:office:office" xmlns:oel="http://schemas.microsoft.com/office/2019/extlst" xmlns:r="http://schemas.openxmlformats.org/officeDocument/2006/relationships" xmlns:m="http://schemas.openxmlformats.org/officeDocument/2006/math" xmlns:v="urn:schemas-microsoft-com:vml" xmlns:wp14="http://schemas.microsoft.com/office/word/2010/wordprocessingDrawing" xmlns:wp="http://schemas.openxmlformats.org/drawingml/2006/wordprocessingDrawing" xmlns:w10="urn:schemas-microsoft-com:office:word" xmlns:w="http://schemas.openxmlformats.org/wordprocessingml/2006/main" xmlns:w14="http://schemas.microsoft.com/office/word/2010/wordml" xmlns:w15="http://schemas.microsoft.com/office/word/2012/wordml" xmlns:w16cex="http://schemas.microsoft.com/office/word/2018/wordml/cex" xmlns:w16cid="http://schemas.microsoft.com/office/word/2016/wordml/cid" xmlns:w16="http://schemas.microsoft.com/office/word/2018/wordml" xmlns:w16du="http://schemas.microsoft.com/office/word/2023/wordml/word16du" xmlns:w16sdtdh="http://schemas.microsoft.com/office/word/2020/wordml/sdtdatahash" xmlns:w16sdtfl="http://schemas.microsoft.com/office/word/2024/wordml/sdtformatlock" xmlns:w16se="http://schemas.microsoft.com/office/word/2015/wordml/symex" xmlns:wpg="http://schemas.microsoft.com/office/word/2010/wordprocessingGroup" xmlns:wpi="http://schemas.microsoft.com/office/word/2010/wordprocessingInk" xmlns:wne="http://schemas.microsoft.com/office/word/2006/wordml" xmlns:wps="http://schemas.microsoft.com/office/word/2010/wordprocessingShape" mc:Ignorable="w14 w15 w16se w16cid w16 w16cex w16sdtdh w16sdtfl w16du wp14">
+<w:endnotes xmlns:wpc="http://schemas.microsoft.com/office/word/2010/wordprocessingCanvas" xmlns:cx="http://schemas.microsoft.com/office/drawing/2014/chartex" xmlns:cx1="http://schemas.microsoft.com/office/drawing/2015/9/8/chartex" xmlns:cx2="http://schemas.microsoft.com/office/drawing/2015/10/21/chartex" xmlns:cx3="http://schemas.microsoft.com/office/drawing/2016/5/9/chartex" xmlns:cx4="http://schemas.microsoft.com/office/drawing/2016/5/10/chartex" xmlns:cx5="http://schemas.microsoft.com/office/drawing/2016/5/11/chartex" xmlns:cx6="http://schemas.microsoft.com/office/drawing/2016/5/12/chartex" xmlns:cx7="http://schemas.microsoft.com/office/drawing/2016/5/13/chartex" xmlns:cx8="http://schemas.microsoft.com/office/drawing/2016/5/14/chartex" xmlns:mc="http://schemas.openxmlformats.org/markup-compatibility/2006" xmlns:aink="http://schemas.microsoft.com/office/drawing/2016/ink" xmlns:am3d="http://schemas.microsoft.com/office/drawing/2017/model3d" xmlns:o="urn:schemas-microsoft-com:office:office" xmlns:oel="http://schemas.microsoft.com/office/2019/extlst" xmlns:r="http://schemas.openxmlformats.org/officeDocument/2006/relationships" xmlns:m="http://schemas.openxmlformats.org/officeDocument/2006/math" xmlns:v="urn:schemas-microsoft-com:vml" xmlns:wp14="http://schemas.microsoft.com/office/word/2010/wordprocessingDrawing" xmlns:wp="http://schemas.openxmlformats.org/drawingml/2006/wordprocessingDrawing" xmlns:w10="urn:schemas-microsoft-com:office:word" xmlns:w="http://schemas.openxmlformats.org/wordprocessingml/2006/main" xmlns:w14="http://schemas.microsoft.com/office/word/2010/wordml" xmlns:w15="http://schemas.microsoft.com/office/word/2012/wordml" xmlns:w16cex="http://schemas.microsoft.com/office/word/2018/wordml/cex" xmlns:w16cid="http://schemas.microsoft.com/office/word/2016/wordml/cid" xmlns:w16="http://schemas.microsoft.com/office/word/2018/wordml" xmlns:w16sdtdh="http://schemas.microsoft.com/office/word/2020/wordml/sdtdatahash" xmlns:w16se="http://schemas.microsoft.com/office/word/2015/wordml/symex" xmlns:wpg="http://schemas.microsoft.com/office/word/2010/wordprocessingGroup" xmlns:wpi="http://schemas.microsoft.com/office/word/2010/wordprocessingInk" xmlns:wne="http://schemas.microsoft.com/office/word/2006/wordml" xmlns:wps="http://schemas.microsoft.com/office/word/2010/wordprocessingShape" mc:Ignorable="w14 w15 w16se w16cid w16 w16cex w16sdtdh wp14">
   <w:endnote w:type="separator" w:id="-1">
     <w:p>
       <w:pPr>
@@ -865,7 +1219,7 @@
 </file>
 
 <file path=word/footnotes.xml><?xml version="1.0" encoding="utf-8"?>
-<w:footnotes xmlns:wpc="http://schemas.microsoft.com/office/word/2010/wordprocessingCanvas" xmlns:cx="http://schemas.microsoft.com/office/drawing/2014/chartex" xmlns:cx1="http://schemas.microsoft.com/office/drawing/2015/9/8/chartex" xmlns:cx2="http://schemas.microsoft.com/office/drawing/2015/10/21/chartex" xmlns:cx3="http://schemas.microsoft.com/office/drawing/2016/5/9/chartex" xmlns:cx4="http://schemas.microsoft.com/office/drawing/2016/5/10/chartex" xmlns:cx5="http://schemas.microsoft.com/office/drawing/2016/5/11/chartex" xmlns:cx6="http://schemas.microsoft.com/office/drawing/2016/5/12/chartex" xmlns:cx7="http://schemas.microsoft.com/office/drawing/2016/5/13/chartex" xmlns:cx8="http://schemas.microsoft.com/office/drawing/2016/5/14/chartex" xmlns:mc="http://schemas.openxmlformats.org/markup-compatibility/2006" xmlns:aink="http://schemas.microsoft.com/office/drawing/2016/ink" xmlns:am3d="http://schemas.microsoft.com/office/drawing/2017/model3d" xmlns:o="urn:schemas-microsoft-com:office:office" xmlns:oel="http://schemas.microsoft.com/office/2019/extlst" xmlns:r="http://schemas.openxmlformats.org/officeDocument/2006/relationships" xmlns:m="http://schemas.openxmlformats.org/officeDocument/2006/math" xmlns:v="urn:schemas-microsoft-com:vml" xmlns:wp14="http://schemas.microsoft.com/office/word/2010/wordprocessingDrawing" xmlns:wp="http://schemas.openxmlformats.org/drawingml/2006/wordprocessingDrawing" xmlns:w10="urn:schemas-microsoft-com:office:word" xmlns:w="http://schemas.openxmlformats.org/wordprocessingml/2006/main" xmlns:w14="http://schemas.microsoft.com/office/word/2010/wordml" xmlns:w15="http://schemas.microsoft.com/office/word/2012/wordml" xmlns:w16cex="http://schemas.microsoft.com/office/word/2018/wordml/cex" xmlns:w16cid="http://schemas.microsoft.com/office/word/2016/wordml/cid" xmlns:w16="http://schemas.microsoft.com/office/word/2018/wordml" xmlns:w16du="http://schemas.microsoft.com/office/word/2023/wordml/word16du" xmlns:w16sdtdh="http://schemas.microsoft.com/office/word/2020/wordml/sdtdatahash" xmlns:w16sdtfl="http://schemas.microsoft.com/office/word/2024/wordml/sdtformatlock" xmlns:w16se="http://schemas.microsoft.com/office/word/2015/wordml/symex" xmlns:wpg="http://schemas.microsoft.com/office/word/2010/wordprocessingGroup" xmlns:wpi="http://schemas.microsoft.com/office/word/2010/wordprocessingInk" xmlns:wne="http://schemas.microsoft.com/office/word/2006/wordml" xmlns:wps="http://schemas.microsoft.com/office/word/2010/wordprocessingShape" mc:Ignorable="w14 w15 w16se w16cid w16 w16cex w16sdtdh w16sdtfl w16du wp14">
+<w:footnotes xmlns:wpc="http://schemas.microsoft.com/office/word/2010/wordprocessingCanvas" xmlns:cx="http://schemas.microsoft.com/office/drawing/2014/chartex" xmlns:cx1="http://schemas.microsoft.com/office/drawing/2015/9/8/chartex" xmlns:cx2="http://schemas.microsoft.com/office/drawing/2015/10/21/chartex" xmlns:cx3="http://schemas.microsoft.com/office/drawing/2016/5/9/chartex" xmlns:cx4="http://schemas.microsoft.com/office/drawing/2016/5/10/chartex" xmlns:cx5="http://schemas.microsoft.com/office/drawing/2016/5/11/chartex" xmlns:cx6="http://schemas.microsoft.com/office/drawing/2016/5/12/chartex" xmlns:cx7="http://schemas.microsoft.com/office/drawing/2016/5/13/chartex" xmlns:cx8="http://schemas.microsoft.com/office/drawing/2016/5/14/chartex" xmlns:mc="http://schemas.openxmlformats.org/markup-compatibility/2006" xmlns:aink="http://schemas.microsoft.com/office/drawing/2016/ink" xmlns:am3d="http://schemas.microsoft.com/office/drawing/2017/model3d" xmlns:o="urn:schemas-microsoft-com:office:office" xmlns:oel="http://schemas.microsoft.com/office/2019/extlst" xmlns:r="http://schemas.openxmlformats.org/officeDocument/2006/relationships" xmlns:m="http://schemas.openxmlformats.org/officeDocument/2006/math" xmlns:v="urn:schemas-microsoft-com:vml" xmlns:wp14="http://schemas.microsoft.com/office/word/2010/wordprocessingDrawing" xmlns:wp="http://schemas.openxmlformats.org/drawingml/2006/wordprocessingDrawing" xmlns:w10="urn:schemas-microsoft-com:office:word" xmlns:w="http://schemas.openxmlformats.org/wordprocessingml/2006/main" xmlns:w14="http://schemas.microsoft.com/office/word/2010/wordml" xmlns:w15="http://schemas.microsoft.com/office/word/2012/wordml" xmlns:w16cex="http://schemas.microsoft.com/office/word/2018/wordml/cex" xmlns:w16cid="http://schemas.microsoft.com/office/word/2016/wordml/cid" xmlns:w16="http://schemas.microsoft.com/office/word/2018/wordml" xmlns:w16sdtdh="http://schemas.microsoft.com/office/word/2020/wordml/sdtdatahash" xmlns:w16se="http://schemas.microsoft.com/office/word/2015/wordml/symex" xmlns:wpg="http://schemas.microsoft.com/office/word/2010/wordprocessingGroup" xmlns:wpi="http://schemas.microsoft.com/office/word/2010/wordprocessingInk" xmlns:wne="http://schemas.microsoft.com/office/word/2006/wordml" xmlns:wps="http://schemas.microsoft.com/office/word/2010/wordprocessingShape" mc:Ignorable="w14 w15 w16se w16cid w16 w16cex w16sdtdh wp14">
   <w:footnote w:type="separator" w:id="-1">
     <w:p>
       <w:pPr>
@@ -890,7 +1244,7 @@
 </file>
 
 <file path=word/header1.xml><?xml version="1.0" encoding="utf-8"?>
-<w:hdr xmlns:wpc="http://schemas.microsoft.com/office/word/2010/wordprocessingCanvas" xmlns:cx="http://schemas.microsoft.com/office/drawing/2014/chartex" xmlns:cx1="http://schemas.microsoft.com/office/drawing/2015/9/8/chartex" xmlns:cx2="http://schemas.microsoft.com/office/drawing/2015/10/21/chartex" xmlns:cx3="http://schemas.microsoft.com/office/drawing/2016/5/9/chartex" xmlns:cx4="http://schemas.microsoft.com/office/drawing/2016/5/10/chartex" xmlns:cx5="http://schemas.microsoft.com/office/drawing/2016/5/11/chartex" xmlns:cx6="http://schemas.microsoft.com/office/drawing/2016/5/12/chartex" xmlns:cx7="http://schemas.microsoft.com/office/drawing/2016/5/13/chartex" xmlns:cx8="http://schemas.microsoft.com/office/drawing/2016/5/14/chartex" xmlns:mc="http://schemas.openxmlformats.org/markup-compatibility/2006" xmlns:aink="http://schemas.microsoft.com/office/drawing/2016/ink" xmlns:am3d="http://schemas.microsoft.com/office/drawing/2017/model3d" xmlns:o="urn:schemas-microsoft-com:office:office" xmlns:oel="http://schemas.microsoft.com/office/2019/extlst" xmlns:r="http://schemas.openxmlformats.org/officeDocument/2006/relationships" xmlns:m="http://schemas.openxmlformats.org/officeDocument/2006/math" xmlns:v="urn:schemas-microsoft-com:vml" xmlns:wp14="http://schemas.microsoft.com/office/word/2010/wordprocessingDrawing" xmlns:wp="http://schemas.openxmlformats.org/drawingml/2006/wordprocessingDrawing" xmlns:w10="urn:schemas-microsoft-com:office:word" xmlns:w="http://schemas.openxmlformats.org/wordprocessingml/2006/main" xmlns:w14="http://schemas.microsoft.com/office/word/2010/wordml" xmlns:w15="http://schemas.microsoft.com/office/word/2012/wordml" xmlns:w16cex="http://schemas.microsoft.com/office/word/2018/wordml/cex" xmlns:w16cid="http://schemas.microsoft.com/office/word/2016/wordml/cid" xmlns:w16="http://schemas.microsoft.com/office/word/2018/wordml" xmlns:w16du="http://schemas.microsoft.com/office/word/2023/wordml/word16du" xmlns:w16sdtdh="http://schemas.microsoft.com/office/word/2020/wordml/sdtdatahash" xmlns:w16sdtfl="http://schemas.microsoft.com/office/word/2024/wordml/sdtformatlock" xmlns:w16se="http://schemas.microsoft.com/office/word/2015/wordml/symex" xmlns:wpg="http://schemas.microsoft.com/office/word/2010/wordprocessingGroup" xmlns:wpi="http://schemas.microsoft.com/office/word/2010/wordprocessingInk" xmlns:wne="http://schemas.microsoft.com/office/word/2006/wordml" xmlns:wps="http://schemas.microsoft.com/office/word/2010/wordprocessingShape" mc:Ignorable="w14 w15 w16se w16cid w16 w16cex w16sdtdh w16sdtfl w16du wp14">
+<w:hdr xmlns:wpc="http://schemas.microsoft.com/office/word/2010/wordprocessingCanvas" xmlns:cx="http://schemas.microsoft.com/office/drawing/2014/chartex" xmlns:cx1="http://schemas.microsoft.com/office/drawing/2015/9/8/chartex" xmlns:cx2="http://schemas.microsoft.com/office/drawing/2015/10/21/chartex" xmlns:cx3="http://schemas.microsoft.com/office/drawing/2016/5/9/chartex" xmlns:cx4="http://schemas.microsoft.com/office/drawing/2016/5/10/chartex" xmlns:cx5="http://schemas.microsoft.com/office/drawing/2016/5/11/chartex" xmlns:cx6="http://schemas.microsoft.com/office/drawing/2016/5/12/chartex" xmlns:cx7="http://schemas.microsoft.com/office/drawing/2016/5/13/chartex" xmlns:cx8="http://schemas.microsoft.com/office/drawing/2016/5/14/chartex" xmlns:mc="http://schemas.openxmlformats.org/markup-compatibility/2006" xmlns:aink="http://schemas.microsoft.com/office/drawing/2016/ink" xmlns:am3d="http://schemas.microsoft.com/office/drawing/2017/model3d" xmlns:o="urn:schemas-microsoft-com:office:office" xmlns:oel="http://schemas.microsoft.com/office/2019/extlst" xmlns:r="http://schemas.openxmlformats.org/officeDocument/2006/relationships" xmlns:m="http://schemas.openxmlformats.org/officeDocument/2006/math" xmlns:v="urn:schemas-microsoft-com:vml" xmlns:wp14="http://schemas.microsoft.com/office/word/2010/wordprocessingDrawing" xmlns:wp="http://schemas.openxmlformats.org/drawingml/2006/wordprocessingDrawing" xmlns:w10="urn:schemas-microsoft-com:office:word" xmlns:w="http://schemas.openxmlformats.org/wordprocessingml/2006/main" xmlns:w14="http://schemas.microsoft.com/office/word/2010/wordml" xmlns:w15="http://schemas.microsoft.com/office/word/2012/wordml" xmlns:w16cex="http://schemas.microsoft.com/office/word/2018/wordml/cex" xmlns:w16cid="http://schemas.microsoft.com/office/word/2016/wordml/cid" xmlns:w16="http://schemas.microsoft.com/office/word/2018/wordml" xmlns:w16sdtdh="http://schemas.microsoft.com/office/word/2020/wordml/sdtdatahash" xmlns:w16se="http://schemas.microsoft.com/office/word/2015/wordml/symex" xmlns:wpg="http://schemas.microsoft.com/office/word/2010/wordprocessingGroup" xmlns:wpi="http://schemas.microsoft.com/office/word/2010/wordprocessingInk" xmlns:wne="http://schemas.microsoft.com/office/word/2006/wordml" xmlns:wps="http://schemas.microsoft.com/office/word/2010/wordprocessingShape" mc:Ignorable="w14 w15 w16se w16cid w16 w16cex w16sdtdh wp14">
   <w:p>
     <w:pPr>
       <w:jc w:val="right"/>
@@ -911,7 +1265,7 @@
 </file>
 
 <file path=word/numbering.xml><?xml version="1.0" encoding="utf-8"?>
-<w:numbering xmlns:wpc="http://schemas.microsoft.com/office/word/2010/wordprocessingCanvas" xmlns:cx="http://schemas.microsoft.com/office/drawing/2014/chartex" xmlns:cx1="http://schemas.microsoft.com/office/drawing/2015/9/8/chartex" xmlns:cx2="http://schemas.microsoft.com/office/drawing/2015/10/21/chartex" xmlns:cx3="http://schemas.microsoft.com/office/drawing/2016/5/9/chartex" xmlns:cx4="http://schemas.microsoft.com/office/drawing/2016/5/10/chartex" xmlns:cx5="http://schemas.microsoft.com/office/drawing/2016/5/11/chartex" xmlns:cx6="http://schemas.microsoft.com/office/drawing/2016/5/12/chartex" xmlns:cx7="http://schemas.microsoft.com/office/drawing/2016/5/13/chartex" xmlns:cx8="http://schemas.microsoft.com/office/drawing/2016/5/14/chartex" xmlns:mc="http://schemas.openxmlformats.org/markup-compatibility/2006" xmlns:aink="http://schemas.microsoft.com/office/drawing/2016/ink" xmlns:am3d="http://schemas.microsoft.com/office/drawing/2017/model3d" xmlns:o="urn:schemas-microsoft-com:office:office" xmlns:oel="http://schemas.microsoft.com/office/2019/extlst" xmlns:r="http://schemas.openxmlformats.org/officeDocument/2006/relationships" xmlns:m="http://schemas.openxmlformats.org/officeDocument/2006/math" xmlns:v="urn:schemas-microsoft-com:vml" xmlns:wp14="http://schemas.microsoft.com/office/word/2010/wordprocessingDrawing" xmlns:wp="http://schemas.openxmlformats.org/drawingml/2006/wordprocessingDrawing" xmlns:w10="urn:schemas-microsoft-com:office:word" xmlns:w="http://schemas.openxmlformats.org/wordprocessingml/2006/main" xmlns:w14="http://schemas.microsoft.com/office/word/2010/wordml" xmlns:w15="http://schemas.microsoft.com/office/word/2012/wordml" xmlns:w16cex="http://schemas.microsoft.com/office/word/2018/wordml/cex" xmlns:w16cid="http://schemas.microsoft.com/office/word/2016/wordml/cid" xmlns:w16="http://schemas.microsoft.com/office/word/2018/wordml" xmlns:w16du="http://schemas.microsoft.com/office/word/2023/wordml/word16du" xmlns:w16sdtdh="http://schemas.microsoft.com/office/word/2020/wordml/sdtdatahash" xmlns:w16sdtfl="http://schemas.microsoft.com/office/word/2024/wordml/sdtformatlock" xmlns:w16se="http://schemas.microsoft.com/office/word/2015/wordml/symex" xmlns:wpg="http://schemas.microsoft.com/office/word/2010/wordprocessingGroup" xmlns:wpi="http://schemas.microsoft.com/office/word/2010/wordprocessingInk" xmlns:wne="http://schemas.microsoft.com/office/word/2006/wordml" xmlns:wps="http://schemas.microsoft.com/office/word/2010/wordprocessingShape" mc:Ignorable="w14 w15 w16se w16cid w16 w16cex w16sdtdh w16sdtfl w16du wp14">
+<w:numbering xmlns:wpc="http://schemas.microsoft.com/office/word/2010/wordprocessingCanvas" xmlns:cx="http://schemas.microsoft.com/office/drawing/2014/chartex" xmlns:cx1="http://schemas.microsoft.com/office/drawing/2015/9/8/chartex" xmlns:cx2="http://schemas.microsoft.com/office/drawing/2015/10/21/chartex" xmlns:cx3="http://schemas.microsoft.com/office/drawing/2016/5/9/chartex" xmlns:cx4="http://schemas.microsoft.com/office/drawing/2016/5/10/chartex" xmlns:cx5="http://schemas.microsoft.com/office/drawing/2016/5/11/chartex" xmlns:cx6="http://schemas.microsoft.com/office/drawing/2016/5/12/chartex" xmlns:cx7="http://schemas.microsoft.com/office/drawing/2016/5/13/chartex" xmlns:cx8="http://schemas.microsoft.com/office/drawing/2016/5/14/chartex" xmlns:mc="http://schemas.openxmlformats.org/markup-compatibility/2006" xmlns:aink="http://schemas.microsoft.com/office/drawing/2016/ink" xmlns:am3d="http://schemas.microsoft.com/office/drawing/2017/model3d" xmlns:o="urn:schemas-microsoft-com:office:office" xmlns:oel="http://schemas.microsoft.com/office/2019/extlst" xmlns:r="http://schemas.openxmlformats.org/officeDocument/2006/relationships" xmlns:m="http://schemas.openxmlformats.org/officeDocument/2006/math" xmlns:v="urn:schemas-microsoft-com:vml" xmlns:wp14="http://schemas.microsoft.com/office/word/2010/wordprocessingDrawing" xmlns:wp="http://schemas.openxmlformats.org/drawingml/2006/wordprocessingDrawing" xmlns:w10="urn:schemas-microsoft-com:office:word" xmlns:w="http://schemas.openxmlformats.org/wordprocessingml/2006/main" xmlns:w14="http://schemas.microsoft.com/office/word/2010/wordml" xmlns:w15="http://schemas.microsoft.com/office/word/2012/wordml" xmlns:w16cex="http://schemas.microsoft.com/office/word/2018/wordml/cex" xmlns:w16cid="http://schemas.microsoft.com/office/word/2016/wordml/cid" xmlns:w16="http://schemas.microsoft.com/office/word/2018/wordml" xmlns:w16sdtdh="http://schemas.microsoft.com/office/word/2020/wordml/sdtdatahash" xmlns:w16se="http://schemas.microsoft.com/office/word/2015/wordml/symex" xmlns:wpg="http://schemas.microsoft.com/office/word/2010/wordprocessingGroup" xmlns:wpi="http://schemas.microsoft.com/office/word/2010/wordprocessingInk" xmlns:wne="http://schemas.microsoft.com/office/word/2006/wordml" xmlns:wps="http://schemas.microsoft.com/office/word/2010/wordprocessingShape" mc:Ignorable="w14 w15 w16se w16cid w16 w16cex w16sdtdh wp14">
   <w:abstractNum w:abstractNumId="0" w15:restartNumberingAfterBreak="0">
     <w:nsid w:val="11A34C52"/>
     <w:multiLevelType w:val="multilevel"/>
@@ -1026,16 +1380,16 @@
     </w:lvl>
   </w:abstractNum>
   <w:abstractNum w:abstractNumId="1" w15:restartNumberingAfterBreak="0">
-    <w:nsid w:val="3F7A6043"/>
+    <w:nsid w:val="13EC70CA"/>
     <w:multiLevelType w:val="hybridMultilevel"/>
-    <w:tmpl w:val="5F9EC630"/>
-    <w:lvl w:ilvl="0" w:tplc="0409000F">
-      <w:start w:val="1"/>
-      <w:numFmt w:val="decimal"/>
-      <w:lvlText w:val="%1."/>
-      <w:lvlJc w:val="left"/>
-      <w:pPr>
-        <w:ind w:left="720" w:hanging="360"/>
+    <w:tmpl w:val="86701214"/>
+    <w:lvl w:ilvl="0" w:tplc="04090017">
+      <w:start w:val="1"/>
+      <w:numFmt w:val="lowerLetter"/>
+      <w:lvlText w:val="%1)"/>
+      <w:lvlJc w:val="left"/>
+      <w:pPr>
+        <w:ind w:left="1500" w:hanging="360"/>
       </w:pPr>
     </w:lvl>
     <w:lvl w:ilvl="1" w:tplc="04090019" w:tentative="1">
@@ -1044,7 +1398,7 @@
       <w:lvlText w:val="%2."/>
       <w:lvlJc w:val="left"/>
       <w:pPr>
-        <w:ind w:left="1440" w:hanging="360"/>
+        <w:ind w:left="2220" w:hanging="360"/>
       </w:pPr>
     </w:lvl>
     <w:lvl w:ilvl="2" w:tplc="0409001B" w:tentative="1">
@@ -1053,7 +1407,7 @@
       <w:lvlText w:val="%3."/>
       <w:lvlJc w:val="right"/>
       <w:pPr>
-        <w:ind w:left="2160" w:hanging="180"/>
+        <w:ind w:left="2940" w:hanging="180"/>
       </w:pPr>
     </w:lvl>
     <w:lvl w:ilvl="3" w:tplc="0409000F" w:tentative="1">
@@ -1062,7 +1416,7 @@
       <w:lvlText w:val="%4."/>
       <w:lvlJc w:val="left"/>
       <w:pPr>
-        <w:ind w:left="2880" w:hanging="360"/>
+        <w:ind w:left="3660" w:hanging="360"/>
       </w:pPr>
     </w:lvl>
     <w:lvl w:ilvl="4" w:tplc="04090019" w:tentative="1">
@@ -1071,7 +1425,7 @@
       <w:lvlText w:val="%5."/>
       <w:lvlJc w:val="left"/>
       <w:pPr>
-        <w:ind w:left="3600" w:hanging="360"/>
+        <w:ind w:left="4380" w:hanging="360"/>
       </w:pPr>
     </w:lvl>
     <w:lvl w:ilvl="5" w:tplc="0409001B" w:tentative="1">
@@ -1080,7 +1434,7 @@
       <w:lvlText w:val="%6."/>
       <w:lvlJc w:val="right"/>
       <w:pPr>
-        <w:ind w:left="4320" w:hanging="180"/>
+        <w:ind w:left="5100" w:hanging="180"/>
       </w:pPr>
     </w:lvl>
     <w:lvl w:ilvl="6" w:tplc="0409000F" w:tentative="1">
@@ -1089,7 +1443,7 @@
       <w:lvlText w:val="%7."/>
       <w:lvlJc w:val="left"/>
       <w:pPr>
-        <w:ind w:left="5040" w:hanging="360"/>
+        <w:ind w:left="5820" w:hanging="360"/>
       </w:pPr>
     </w:lvl>
     <w:lvl w:ilvl="7" w:tplc="04090019" w:tentative="1">
@@ -1098,7 +1452,7 @@
       <w:lvlText w:val="%8."/>
       <w:lvlJc w:val="left"/>
       <w:pPr>
-        <w:ind w:left="5760" w:hanging="360"/>
+        <w:ind w:left="6540" w:hanging="360"/>
       </w:pPr>
     </w:lvl>
     <w:lvl w:ilvl="8" w:tplc="0409001B" w:tentative="1">
@@ -1107,11 +1461,97 @@
       <w:lvlText w:val="%9."/>
       <w:lvlJc w:val="right"/>
       <w:pPr>
-        <w:ind w:left="6480" w:hanging="180"/>
+        <w:ind w:left="7260" w:hanging="180"/>
       </w:pPr>
     </w:lvl>
   </w:abstractNum>
   <w:abstractNum w:abstractNumId="2" w15:restartNumberingAfterBreak="0">
+    <w:nsid w:val="389862B2"/>
+    <w:multiLevelType w:val="hybridMultilevel"/>
+    <w:tmpl w:val="44FE2B1E"/>
+    <w:lvl w:ilvl="0" w:tplc="0409000F">
+      <w:start w:val="1"/>
+      <w:numFmt w:val="decimal"/>
+      <w:lvlText w:val="%1."/>
+      <w:lvlJc w:val="left"/>
+      <w:pPr>
+        <w:ind w:left="780" w:hanging="360"/>
+      </w:pPr>
+    </w:lvl>
+    <w:lvl w:ilvl="1" w:tplc="04090019" w:tentative="1">
+      <w:start w:val="1"/>
+      <w:numFmt w:val="lowerLetter"/>
+      <w:lvlText w:val="%2."/>
+      <w:lvlJc w:val="left"/>
+      <w:pPr>
+        <w:ind w:left="1500" w:hanging="360"/>
+      </w:pPr>
+    </w:lvl>
+    <w:lvl w:ilvl="2" w:tplc="0409001B" w:tentative="1">
+      <w:start w:val="1"/>
+      <w:numFmt w:val="lowerRoman"/>
+      <w:lvlText w:val="%3."/>
+      <w:lvlJc w:val="right"/>
+      <w:pPr>
+        <w:ind w:left="2220" w:hanging="180"/>
+      </w:pPr>
+    </w:lvl>
+    <w:lvl w:ilvl="3" w:tplc="0409000F" w:tentative="1">
+      <w:start w:val="1"/>
+      <w:numFmt w:val="decimal"/>
+      <w:lvlText w:val="%4."/>
+      <w:lvlJc w:val="left"/>
+      <w:pPr>
+        <w:ind w:left="2940" w:hanging="360"/>
+      </w:pPr>
+    </w:lvl>
+    <w:lvl w:ilvl="4" w:tplc="04090019" w:tentative="1">
+      <w:start w:val="1"/>
+      <w:numFmt w:val="lowerLetter"/>
+      <w:lvlText w:val="%5."/>
+      <w:lvlJc w:val="left"/>
+      <w:pPr>
+        <w:ind w:left="3660" w:hanging="360"/>
+      </w:pPr>
+    </w:lvl>
+    <w:lvl w:ilvl="5" w:tplc="0409001B" w:tentative="1">
+      <w:start w:val="1"/>
+      <w:numFmt w:val="lowerRoman"/>
+      <w:lvlText w:val="%6."/>
+      <w:lvlJc w:val="right"/>
+      <w:pPr>
+        <w:ind w:left="4380" w:hanging="180"/>
+      </w:pPr>
+    </w:lvl>
+    <w:lvl w:ilvl="6" w:tplc="0409000F" w:tentative="1">
+      <w:start w:val="1"/>
+      <w:numFmt w:val="decimal"/>
+      <w:lvlText w:val="%7."/>
+      <w:lvlJc w:val="left"/>
+      <w:pPr>
+        <w:ind w:left="5100" w:hanging="360"/>
+      </w:pPr>
+    </w:lvl>
+    <w:lvl w:ilvl="7" w:tplc="04090019" w:tentative="1">
+      <w:start w:val="1"/>
+      <w:numFmt w:val="lowerLetter"/>
+      <w:lvlText w:val="%8."/>
+      <w:lvlJc w:val="left"/>
+      <w:pPr>
+        <w:ind w:left="5820" w:hanging="360"/>
+      </w:pPr>
+    </w:lvl>
+    <w:lvl w:ilvl="8" w:tplc="0409001B" w:tentative="1">
+      <w:start w:val="1"/>
+      <w:numFmt w:val="lowerRoman"/>
+      <w:lvlText w:val="%9."/>
+      <w:lvlJc w:val="right"/>
+      <w:pPr>
+        <w:ind w:left="6540" w:hanging="180"/>
+      </w:pPr>
+    </w:lvl>
+  </w:abstractNum>
+  <w:abstractNum w:abstractNumId="3" w15:restartNumberingAfterBreak="0">
     <w:nsid w:val="57592E33"/>
     <w:multiLevelType w:val="multilevel"/>
     <w:tmpl w:val="426ED8CA"/>
@@ -1224,7 +1664,7 @@
       </w:rPr>
     </w:lvl>
   </w:abstractNum>
-  <w:abstractNum w:abstractNumId="3" w15:restartNumberingAfterBreak="0">
+  <w:abstractNum w:abstractNumId="4" w15:restartNumberingAfterBreak="0">
     <w:nsid w:val="593213E1"/>
     <w:multiLevelType w:val="multilevel"/>
     <w:tmpl w:val="1A208238"/>
@@ -1335,92 +1775,6 @@
       <w:rPr>
         <w:u w:val="none"/>
       </w:rPr>
-    </w:lvl>
-  </w:abstractNum>
-  <w:abstractNum w:abstractNumId="4" w15:restartNumberingAfterBreak="0">
-    <w:nsid w:val="6AF51A47"/>
-    <w:multiLevelType w:val="hybridMultilevel"/>
-    <w:tmpl w:val="9D461244"/>
-    <w:lvl w:ilvl="0" w:tplc="04090017">
-      <w:start w:val="1"/>
-      <w:numFmt w:val="lowerLetter"/>
-      <w:lvlText w:val="%1)"/>
-      <w:lvlJc w:val="left"/>
-      <w:pPr>
-        <w:ind w:left="1440" w:hanging="360"/>
-      </w:pPr>
-    </w:lvl>
-    <w:lvl w:ilvl="1" w:tplc="04090019" w:tentative="1">
-      <w:start w:val="1"/>
-      <w:numFmt w:val="lowerLetter"/>
-      <w:lvlText w:val="%2."/>
-      <w:lvlJc w:val="left"/>
-      <w:pPr>
-        <w:ind w:left="2160" w:hanging="360"/>
-      </w:pPr>
-    </w:lvl>
-    <w:lvl w:ilvl="2" w:tplc="0409001B" w:tentative="1">
-      <w:start w:val="1"/>
-      <w:numFmt w:val="lowerRoman"/>
-      <w:lvlText w:val="%3."/>
-      <w:lvlJc w:val="right"/>
-      <w:pPr>
-        <w:ind w:left="2880" w:hanging="180"/>
-      </w:pPr>
-    </w:lvl>
-    <w:lvl w:ilvl="3" w:tplc="0409000F" w:tentative="1">
-      <w:start w:val="1"/>
-      <w:numFmt w:val="decimal"/>
-      <w:lvlText w:val="%4."/>
-      <w:lvlJc w:val="left"/>
-      <w:pPr>
-        <w:ind w:left="3600" w:hanging="360"/>
-      </w:pPr>
-    </w:lvl>
-    <w:lvl w:ilvl="4" w:tplc="04090019" w:tentative="1">
-      <w:start w:val="1"/>
-      <w:numFmt w:val="lowerLetter"/>
-      <w:lvlText w:val="%5."/>
-      <w:lvlJc w:val="left"/>
-      <w:pPr>
-        <w:ind w:left="4320" w:hanging="360"/>
-      </w:pPr>
-    </w:lvl>
-    <w:lvl w:ilvl="5" w:tplc="0409001B" w:tentative="1">
-      <w:start w:val="1"/>
-      <w:numFmt w:val="lowerRoman"/>
-      <w:lvlText w:val="%6."/>
-      <w:lvlJc w:val="right"/>
-      <w:pPr>
-        <w:ind w:left="5040" w:hanging="180"/>
-      </w:pPr>
-    </w:lvl>
-    <w:lvl w:ilvl="6" w:tplc="0409000F" w:tentative="1">
-      <w:start w:val="1"/>
-      <w:numFmt w:val="decimal"/>
-      <w:lvlText w:val="%7."/>
-      <w:lvlJc w:val="left"/>
-      <w:pPr>
-        <w:ind w:left="5760" w:hanging="360"/>
-      </w:pPr>
-    </w:lvl>
-    <w:lvl w:ilvl="7" w:tplc="04090019" w:tentative="1">
-      <w:start w:val="1"/>
-      <w:numFmt w:val="lowerLetter"/>
-      <w:lvlText w:val="%8."/>
-      <w:lvlJc w:val="left"/>
-      <w:pPr>
-        <w:ind w:left="6480" w:hanging="360"/>
-      </w:pPr>
-    </w:lvl>
-    <w:lvl w:ilvl="8" w:tplc="0409001B" w:tentative="1">
-      <w:start w:val="1"/>
-      <w:numFmt w:val="lowerRoman"/>
-      <w:lvlText w:val="%9."/>
-      <w:lvlJc w:val="right"/>
-      <w:pPr>
-        <w:ind w:left="7200" w:hanging="180"/>
-      </w:pPr>
     </w:lvl>
   </w:abstractNum>
   <w:abstractNum w:abstractNumId="5" w15:restartNumberingAfterBreak="0">
@@ -1537,7 +1891,7 @@
     </w:lvl>
   </w:abstractNum>
   <w:num w:numId="1" w16cid:durableId="1138113057">
-    <w:abstractNumId w:val="3"/>
+    <w:abstractNumId w:val="4"/>
   </w:num>
   <w:num w:numId="2" w16cid:durableId="1868247903">
     <w:abstractNumId w:val="0"/>
@@ -1546,19 +1900,19 @@
     <w:abstractNumId w:val="5"/>
   </w:num>
   <w:num w:numId="4" w16cid:durableId="1231696916">
+    <w:abstractNumId w:val="3"/>
+  </w:num>
+  <w:num w:numId="5" w16cid:durableId="440105096">
     <w:abstractNumId w:val="2"/>
   </w:num>
-  <w:num w:numId="5" w16cid:durableId="1424228356">
+  <w:num w:numId="6" w16cid:durableId="205335544">
     <w:abstractNumId w:val="1"/>
-  </w:num>
-  <w:num w:numId="6" w16cid:durableId="9571931">
-    <w:abstractNumId w:val="4"/>
   </w:num>
 </w:numbering>
 </file>
 
 <file path=word/styles.xml><?xml version="1.0" encoding="utf-8"?>
-<w:styles xmlns:mc="http://schemas.openxmlformats.org/markup-compatibility/2006" xmlns:r="http://schemas.openxmlformats.org/officeDocument/2006/relationships" xmlns:w="http://schemas.openxmlformats.org/wordprocessingml/2006/main" xmlns:w14="http://schemas.microsoft.com/office/word/2010/wordml" xmlns:w15="http://schemas.microsoft.com/office/word/2012/wordml" xmlns:w16cex="http://schemas.microsoft.com/office/word/2018/wordml/cex" xmlns:w16cid="http://schemas.microsoft.com/office/word/2016/wordml/cid" xmlns:w16="http://schemas.microsoft.com/office/word/2018/wordml" xmlns:w16du="http://schemas.microsoft.com/office/word/2023/wordml/word16du" xmlns:w16sdtdh="http://schemas.microsoft.com/office/word/2020/wordml/sdtdatahash" xmlns:w16sdtfl="http://schemas.microsoft.com/office/word/2024/wordml/sdtformatlock" xmlns:w16se="http://schemas.microsoft.com/office/word/2015/wordml/symex" mc:Ignorable="w14 w15 w16se w16cid w16 w16cex w16sdtdh w16sdtfl w16du">
+<w:styles xmlns:mc="http://schemas.openxmlformats.org/markup-compatibility/2006" xmlns:r="http://schemas.openxmlformats.org/officeDocument/2006/relationships" xmlns:w="http://schemas.openxmlformats.org/wordprocessingml/2006/main" xmlns:w14="http://schemas.microsoft.com/office/word/2010/wordml" xmlns:w15="http://schemas.microsoft.com/office/word/2012/wordml" xmlns:w16cex="http://schemas.microsoft.com/office/word/2018/wordml/cex" xmlns:w16cid="http://schemas.microsoft.com/office/word/2016/wordml/cid" xmlns:w16="http://schemas.microsoft.com/office/word/2018/wordml" xmlns:w16sdtdh="http://schemas.microsoft.com/office/word/2020/wordml/sdtdatahash" xmlns:w16se="http://schemas.microsoft.com/office/word/2015/wordml/symex" mc:Ignorable="w14 w15 w16se w16cid w16 w16cex w16sdtdh">
   <w:docDefaults>
     <w:rPrDefault>
       <w:rPr>
@@ -1956,7 +2310,7 @@
     <w:name w:val="Normal"/>
     <w:qFormat/>
   </w:style>
-  <w:style w:type="paragraph" w:styleId="Heading1">
+  <w:style w:type="paragraph" w:styleId="Ttulo1">
     <w:name w:val="heading 1"/>
     <w:basedOn w:val="Normal"/>
     <w:next w:val="Normal"/>
@@ -1973,7 +2327,7 @@
       <w:szCs w:val="40"/>
     </w:rPr>
   </w:style>
-  <w:style w:type="paragraph" w:styleId="Heading2">
+  <w:style w:type="paragraph" w:styleId="Ttulo2">
     <w:name w:val="heading 2"/>
     <w:basedOn w:val="Normal"/>
     <w:next w:val="Normal"/>
@@ -1992,7 +2346,7 @@
       <w:szCs w:val="32"/>
     </w:rPr>
   </w:style>
-  <w:style w:type="paragraph" w:styleId="Heading3">
+  <w:style w:type="paragraph" w:styleId="Ttulo3">
     <w:name w:val="heading 3"/>
     <w:basedOn w:val="Normal"/>
     <w:next w:val="Normal"/>
@@ -2012,7 +2366,7 @@
       <w:szCs w:val="28"/>
     </w:rPr>
   </w:style>
-  <w:style w:type="paragraph" w:styleId="Heading4">
+  <w:style w:type="paragraph" w:styleId="Ttulo4">
     <w:name w:val="heading 4"/>
     <w:basedOn w:val="Normal"/>
     <w:next w:val="Normal"/>
@@ -2032,7 +2386,7 @@
       <w:szCs w:val="24"/>
     </w:rPr>
   </w:style>
-  <w:style w:type="paragraph" w:styleId="Heading5">
+  <w:style w:type="paragraph" w:styleId="Ttulo5">
     <w:name w:val="heading 5"/>
     <w:basedOn w:val="Normal"/>
     <w:next w:val="Normal"/>
@@ -2050,7 +2404,7 @@
       <w:color w:val="666666"/>
     </w:rPr>
   </w:style>
-  <w:style w:type="paragraph" w:styleId="Heading6">
+  <w:style w:type="paragraph" w:styleId="Ttulo6">
     <w:name w:val="heading 6"/>
     <w:basedOn w:val="Normal"/>
     <w:next w:val="Normal"/>
@@ -2070,13 +2424,13 @@
       <w:color w:val="666666"/>
     </w:rPr>
   </w:style>
-  <w:style w:type="character" w:default="1" w:styleId="DefaultParagraphFont">
+  <w:style w:type="character" w:default="1" w:styleId="Fuentedeprrafopredeter">
     <w:name w:val="Default Paragraph Font"/>
     <w:uiPriority w:val="1"/>
     <w:semiHidden/>
     <w:unhideWhenUsed/>
   </w:style>
-  <w:style w:type="table" w:default="1" w:styleId="TableNormal">
+  <w:style w:type="table" w:default="1" w:styleId="Tablanormal">
     <w:name w:val="Normal Table"/>
     <w:uiPriority w:val="99"/>
     <w:semiHidden/>
@@ -2091,13 +2445,13 @@
       </w:tblCellMar>
     </w:tblPr>
   </w:style>
-  <w:style w:type="numbering" w:default="1" w:styleId="NoList">
+  <w:style w:type="numbering" w:default="1" w:styleId="Sinlista">
     <w:name w:val="No List"/>
     <w:uiPriority w:val="99"/>
     <w:semiHidden/>
     <w:unhideWhenUsed/>
   </w:style>
-  <w:style w:type="table" w:customStyle="1" w:styleId="TableNormal0">
+  <w:style w:type="table" w:customStyle="1" w:styleId="TableNormal">
     <w:name w:val="TableNormal"/>
     <w:tblPr>
       <w:tblCellMar>
@@ -2108,7 +2462,7 @@
       </w:tblCellMar>
     </w:tblPr>
   </w:style>
-  <w:style w:type="paragraph" w:styleId="Title">
+  <w:style w:type="paragraph" w:styleId="Ttulo">
     <w:name w:val="Title"/>
     <w:basedOn w:val="Normal"/>
     <w:next w:val="Normal"/>
@@ -2124,7 +2478,7 @@
       <w:szCs w:val="52"/>
     </w:rPr>
   </w:style>
-  <w:style w:type="paragraph" w:styleId="Subtitle">
+  <w:style w:type="paragraph" w:styleId="Subttulo">
     <w:name w:val="Subtitle"/>
     <w:basedOn w:val="Normal"/>
     <w:next w:val="Normal"/>
@@ -2142,14 +2496,14 @@
     </w:rPr>
   </w:style>
   <w:style w:type="table" w:customStyle="1" w:styleId="a">
-    <w:basedOn w:val="TableNormal0"/>
+    <w:basedOn w:val="TableNormal"/>
     <w:tblPr>
       <w:tblStyleRowBandSize w:val="1"/>
       <w:tblStyleColBandSize w:val="1"/>
     </w:tblPr>
   </w:style>
   <w:style w:type="table" w:customStyle="1" w:styleId="a0">
-    <w:basedOn w:val="TableNormal0"/>
+    <w:basedOn w:val="TableNormal"/>
     <w:tblPr>
       <w:tblStyleRowBandSize w:val="1"/>
       <w:tblStyleColBandSize w:val="1"/>
@@ -2157,8 +2511,8 @@
   </w:style>
   <w:style w:type="table" w:customStyle="1" w:styleId="1">
     <w:name w:val="1"/>
-    <w:basedOn w:val="TableNormal"/>
-    <w:rsid w:val="00BD7F50"/>
+    <w:basedOn w:val="Tablanormal"/>
+    <w:rsid w:val="00BA3EB0"/>
     <w:tblPr>
       <w:tblStyleRowBandSize w:val="1"/>
       <w:tblStyleColBandSize w:val="1"/>
@@ -2171,12 +2525,12 @@
       </w:tblCellMar>
     </w:tblPr>
   </w:style>
-  <w:style w:type="paragraph" w:styleId="ListParagraph">
+  <w:style w:type="paragraph" w:styleId="Prrafodelista">
     <w:name w:val="List Paragraph"/>
     <w:basedOn w:val="Normal"/>
     <w:uiPriority w:val="34"/>
     <w:qFormat/>
-    <w:rsid w:val="00BD7F50"/>
+    <w:rsid w:val="00BA3EB0"/>
     <w:pPr>
       <w:ind w:left="720"/>
       <w:contextualSpacing/>

</xml_diff>